<commit_message>
Add repository URL to submission documents
Replaces the placeholder in the reproducibility appendices and adds the
repository to the concept note's tools table.
</commit_message>
<xml_diff>
--- a/AMLDL_Assignment2_AdventureWorks_Progress_Report.docx
+++ b/AMLDL_Assignment2_AdventureWorks_Progress_Report.docx
@@ -9654,7 +9654,7 @@
               <w:rPr>
                 <w:sz w:val="18"/>
               </w:rPr>
-              <w:t>Colab / Git link</w:t>
+              <w:t>Git repository</w:t>
             </w:r>
           </w:p>
         </w:tc>
@@ -9667,7 +9667,7 @@
               <w:rPr>
                 <w:sz w:val="18"/>
               </w:rPr>
-              <w:t>[paste your link here before submission]</w:t>
+              <w:t>https://github.com/SangithaV2024BC26670/amldl-assignment2-bike-buyer</w:t>
             </w:r>
           </w:p>
         </w:tc>

</xml_diff>